<commit_message>
Moving Files and Updating Documentation
</commit_message>
<xml_diff>
--- a/MiniRCCar.docx
+++ b/MiniRCCar.docx
@@ -455,23 +455,7 @@
           <w:sz w:val="20"/>
           <w:szCs w:val="20"/>
         </w:rPr>
-        <w:t>Screen on controller to change modes/keep track of things (</w:t>
-      </w:r>
-      <w:proofErr w:type="spellStart"/>
-      <w:r>
-        <w:rPr>
-          <w:sz w:val="20"/>
-          <w:szCs w:val="20"/>
-        </w:rPr>
-        <w:t>i.e</w:t>
-      </w:r>
-      <w:proofErr w:type="spellEnd"/>
-      <w:r>
-        <w:rPr>
-          <w:sz w:val="20"/>
-          <w:szCs w:val="20"/>
-        </w:rPr>
-        <w:t xml:space="preserve"> points)</w:t>
+        <w:t>Screen on controller to change modes/keep track of things (i.e points)</w:t>
       </w:r>
     </w:p>
     <w:p>
@@ -491,23 +475,7 @@
           <w:sz w:val="20"/>
           <w:szCs w:val="20"/>
         </w:rPr>
-        <w:t>A sensor to allow the car to interact with the outside world (</w:t>
-      </w:r>
-      <w:proofErr w:type="spellStart"/>
-      <w:r>
-        <w:rPr>
-          <w:sz w:val="20"/>
-          <w:szCs w:val="20"/>
-        </w:rPr>
-        <w:t>i.e</w:t>
-      </w:r>
-      <w:proofErr w:type="spellEnd"/>
-      <w:r>
-        <w:rPr>
-          <w:sz w:val="20"/>
-          <w:szCs w:val="20"/>
-        </w:rPr>
-        <w:t xml:space="preserve"> </w:t>
+        <w:t xml:space="preserve">A sensor to allow the car to interact with the outside world (i.e </w:t>
       </w:r>
       <w:r>
         <w:rPr>
@@ -591,29 +559,13 @@
           <w:b/>
           <w:bCs/>
         </w:rPr>
-        <w:t xml:space="preserve"> using </w:t>
-      </w:r>
-      <w:proofErr w:type="spellStart"/>
+        <w:t xml:space="preserve"> using ChaptGPT OpenAI</w:t>
+      </w:r>
       <w:r>
         <w:rPr>
           <w:b/>
           <w:bCs/>
         </w:rPr>
-        <w:t>ChaptGPT</w:t>
-      </w:r>
-      <w:proofErr w:type="spellEnd"/>
-      <w:r>
-        <w:rPr>
-          <w:b/>
-          <w:bCs/>
-        </w:rPr>
-        <w:t xml:space="preserve"> OpenAI</w:t>
-      </w:r>
-      <w:r>
-        <w:rPr>
-          <w:b/>
-          <w:bCs/>
-        </w:rPr>
         <w:t>:</w:t>
       </w:r>
     </w:p>
@@ -650,15 +602,7 @@
         <w:t>. With the idea of a more compact design that allows for simple quick changes to the body of the car</w:t>
       </w:r>
       <w:r>
-        <w:t xml:space="preserve"> and limited </w:t>
-      </w:r>
-      <w:proofErr w:type="gramStart"/>
-      <w:r>
-        <w:t>connections</w:t>
-      </w:r>
-      <w:proofErr w:type="gramEnd"/>
-      <w:r>
-        <w:t xml:space="preserve"> a</w:t>
+        <w:t xml:space="preserve"> and limited connections a</w:t>
       </w:r>
       <w:r>
         <w:t>n</w:t>
@@ -683,16 +627,8 @@
         <w:rPr>
           <w:u w:val="single"/>
         </w:rPr>
-        <w:t xml:space="preserve">How should we deal with differential </w:t>
-      </w:r>
-      <w:proofErr w:type="gramStart"/>
-      <w:r>
-        <w:rPr>
-          <w:u w:val="single"/>
-        </w:rPr>
-        <w:t>gear</w:t>
-      </w:r>
-      <w:proofErr w:type="gramEnd"/>
+        <w:t>How should we deal with differential gear</w:t>
+      </w:r>
       <w:r>
         <w:rPr>
           <w:u w:val="single"/>
@@ -825,15 +761,7 @@
         <w:t xml:space="preserve"> degrees. </w:t>
       </w:r>
       <w:r>
-        <w:t xml:space="preserve">Using </w:t>
-      </w:r>
-      <w:proofErr w:type="gramStart"/>
-      <w:r>
-        <w:t>to</w:t>
-      </w:r>
-      <w:proofErr w:type="gramEnd"/>
-      <w:r>
-        <w:t xml:space="preserve"> much will cause strain and cause the servo to draw more current. </w:t>
+        <w:t xml:space="preserve">Using to much will cause strain and cause the servo to draw more current. </w:t>
       </w:r>
       <w:r>
         <w:t>Chat recommends connecting it to a regulated 5-6v</w:t>
@@ -1225,17 +1153,26 @@
         </w:rPr>
         <w:t>Circuit design</w:t>
       </w:r>
-    </w:p>
-    <w:p>
-      <w:pPr>
-        <w:rPr>
+      <w:r>
+        <w:rPr>
+          <w:b/>
           <w:bCs/>
-        </w:rPr>
-      </w:pPr>
-      <w:r>
+          <w:sz w:val="28"/>
+          <w:szCs w:val="28"/>
+        </w:rPr>
+        <w:t>/Picking Items</w:t>
+      </w:r>
+    </w:p>
+    <w:p>
+      <w:pPr>
         <w:rPr>
           <w:bCs/>
         </w:rPr>
+      </w:pPr>
+      <w:r>
+        <w:rPr>
+          <w:bCs/>
+        </w:rPr>
         <w:t xml:space="preserve">With a quick </w:t>
       </w:r>
       <w:r>
@@ -1272,15 +1209,7 @@
         <w:t xml:space="preserve"> the motors in our RC car circuit. </w:t>
       </w:r>
       <w:r>
-        <w:t xml:space="preserve">This blog shows how to use </w:t>
-      </w:r>
-      <w:proofErr w:type="gramStart"/>
-      <w:r>
-        <w:t>the DRV8833</w:t>
-      </w:r>
-      <w:proofErr w:type="gramEnd"/>
-      <w:r>
-        <w:t xml:space="preserve"> with a double motor setup </w:t>
+        <w:t xml:space="preserve">This blog shows how to use the DRV8833 with a double motor setup </w:t>
       </w:r>
       <w:hyperlink r:id="rId6" w:history="1">
         <w:r>
@@ -1300,7 +1229,7 @@
           <w:noProof/>
         </w:rPr>
         <w:drawing>
-          <wp:inline distT="0" distB="0" distL="0" distR="0" wp14:anchorId="5CB84737" wp14:editId="16AC5A75">
+          <wp:inline distT="0" distB="0" distL="0" distR="0" wp14:anchorId="5CB84737" wp14:editId="3C2153FD">
             <wp:extent cx="2651760" cy="1465834"/>
             <wp:effectExtent l="0" t="0" r="0" b="1270"/>
             <wp:docPr id="816890943" name="Picture 1" descr="Interfacing DRV8833 Dual Motor Driver Module with Arduino"/>
@@ -1356,7 +1285,7 @@
           <w:noProof/>
         </w:rPr>
         <w:drawing>
-          <wp:inline distT="0" distB="0" distL="0" distR="0" wp14:anchorId="6833FBAA" wp14:editId="09157168">
+          <wp:inline distT="0" distB="0" distL="0" distR="0" wp14:anchorId="6833FBAA" wp14:editId="01E7FEA9">
             <wp:extent cx="2293620" cy="1468799"/>
             <wp:effectExtent l="0" t="0" r="0" b="0"/>
             <wp:docPr id="1755532940" name="Picture 1" descr="Control DC Motors with Arduino and L293D Motor Driver IC"/>
@@ -3319,6 +3248,87 @@
           <w:bCs/>
         </w:rPr>
       </w:pPr>
+    </w:p>
+    <w:p>
+      <w:pPr>
+        <w:rPr>
+          <w:bCs/>
+        </w:rPr>
+      </w:pPr>
+    </w:p>
+    <w:p>
+      <w:pPr>
+        <w:rPr>
+          <w:b/>
+          <w:sz w:val="28"/>
+          <w:szCs w:val="28"/>
+        </w:rPr>
+      </w:pPr>
+      <w:r>
+        <w:rPr>
+          <w:b/>
+          <w:sz w:val="28"/>
+          <w:szCs w:val="28"/>
+        </w:rPr>
+        <w:t>Starting</w:t>
+      </w:r>
+    </w:p>
+    <w:p>
+      <w:pPr>
+        <w:rPr>
+          <w:bCs/>
+          <w:sz w:val="22"/>
+          <w:szCs w:val="22"/>
+        </w:rPr>
+      </w:pPr>
+      <w:r>
+        <w:rPr>
+          <w:bCs/>
+          <w:sz w:val="22"/>
+          <w:szCs w:val="22"/>
+        </w:rPr>
+        <w:t>Since we want to know how everything will work together and be able to better tie everything together</w:t>
+      </w:r>
+      <w:r>
+        <w:rPr>
+          <w:bCs/>
+          <w:sz w:val="22"/>
+          <w:szCs w:val="22"/>
+        </w:rPr>
+        <w:t xml:space="preserve">, we have bought the components we believe we will need and will </w:t>
+      </w:r>
+      <w:r>
+        <w:rPr>
+          <w:bCs/>
+          <w:sz w:val="22"/>
+          <w:szCs w:val="22"/>
+        </w:rPr>
+        <w:t xml:space="preserve">test them separately and then together. </w:t>
+      </w:r>
+      <w:r>
+        <w:rPr>
+          <w:bCs/>
+          <w:sz w:val="22"/>
+          <w:szCs w:val="22"/>
+        </w:rPr>
+        <w:t xml:space="preserve"> We are going to start with the controller because we believe that it will be easier to set up</w:t>
+      </w:r>
+      <w:r>
+        <w:rPr>
+          <w:bCs/>
+          <w:sz w:val="22"/>
+          <w:szCs w:val="22"/>
+        </w:rPr>
+        <w:t>, and we can find a solution to powering it more easily and better before moving to the more power-dependent</w:t>
+      </w:r>
+      <w:r>
+        <w:rPr>
+          <w:bCs/>
+          <w:sz w:val="22"/>
+          <w:szCs w:val="22"/>
+        </w:rPr>
+        <w:t xml:space="preserve"> build of the RC car.</w:t>
+      </w:r>
     </w:p>
     <w:sectPr>
       <w:type w:val="continuous"/>

</xml_diff>

<commit_message>
Added Address Pairing Mode
</commit_message>
<xml_diff>
--- a/MiniRCCar.docx
+++ b/MiniRCCar.docx
@@ -1229,7 +1229,7 @@
           <w:noProof/>
         </w:rPr>
         <w:drawing>
-          <wp:inline distT="0" distB="0" distL="0" distR="0" wp14:anchorId="5CB84737" wp14:editId="657938B7">
+          <wp:inline distT="0" distB="0" distL="0" distR="0" wp14:anchorId="5CB84737" wp14:editId="71FAEDCF">
             <wp:extent cx="2651760" cy="1465834"/>
             <wp:effectExtent l="0" t="0" r="0" b="1270"/>
             <wp:docPr id="816890943" name="Picture 1" descr="Interfacing DRV8833 Dual Motor Driver Module with Arduino"/>
@@ -1285,7 +1285,7 @@
           <w:noProof/>
         </w:rPr>
         <w:drawing>
-          <wp:inline distT="0" distB="0" distL="0" distR="0" wp14:anchorId="6833FBAA" wp14:editId="0B08A39B">
+          <wp:inline distT="0" distB="0" distL="0" distR="0" wp14:anchorId="6833FBAA" wp14:editId="5ACC7D97">
             <wp:extent cx="2293620" cy="1468799"/>
             <wp:effectExtent l="0" t="0" r="0" b="0"/>
             <wp:docPr id="1755532940" name="Picture 1" descr="Control DC Motors with Arduino and L293D Motor Driver IC"/>
@@ -2294,7 +2294,7 @@
               <w:rPr>
                 <w:bCs/>
               </w:rPr>
-              <w:t>Button 1</w:t>
+              <w:t>nRF24l01 CSN</w:t>
             </w:r>
           </w:p>
         </w:tc>
@@ -2372,7 +2372,7 @@
               <w:rPr>
                 <w:bCs/>
               </w:rPr>
-              <w:t>Button 2</w:t>
+              <w:t>nRF24l01 CE</w:t>
             </w:r>
           </w:p>
         </w:tc>
@@ -2450,7 +2450,7 @@
               <w:rPr>
                 <w:bCs/>
               </w:rPr>
-              <w:t>nRF24l01 CSN</w:t>
+              <w:t>Button 1</w:t>
             </w:r>
           </w:p>
         </w:tc>
@@ -2528,7 +2528,7 @@
               <w:rPr>
                 <w:bCs/>
               </w:rPr>
-              <w:t>nRF24l01 CE</w:t>
+              <w:t>Button 2</w:t>
             </w:r>
           </w:p>
         </w:tc>
@@ -2583,6 +2583,12 @@
                 <w:bCs/>
               </w:rPr>
             </w:pPr>
+            <w:r>
+              <w:rPr>
+                <w:bCs/>
+              </w:rPr>
+              <w:t>D6</w:t>
+            </w:r>
           </w:p>
         </w:tc>
         <w:tc>
@@ -3345,7 +3351,64 @@
           <w:szCs w:val="22"/>
         </w:rPr>
         <w:lastRenderedPageBreak/>
-        <w:t>First thing we tried was setting up the buttons. While we worked on our breadboard we noticed some weird issues, moving to a different bread board solved the issue with bad connections. We tried the buttons with and without pull down resistors to check the result</w:t>
+        <w:t>10-22</w:t>
+      </w:r>
+    </w:p>
+    <w:p>
+      <w:pPr>
+        <w:rPr>
+          <w:bCs/>
+          <w:sz w:val="22"/>
+          <w:szCs w:val="22"/>
+        </w:rPr>
+      </w:pPr>
+      <w:r>
+        <w:rPr>
+          <w:bCs/>
+          <w:sz w:val="22"/>
+          <w:szCs w:val="22"/>
+        </w:rPr>
+        <w:t>The first</w:t>
+      </w:r>
+      <w:r>
+        <w:rPr>
+          <w:bCs/>
+          <w:sz w:val="22"/>
+          <w:szCs w:val="22"/>
+        </w:rPr>
+        <w:t xml:space="preserve"> thing we tried was setting up the buttons. While we worked on our breadboard</w:t>
+      </w:r>
+      <w:r>
+        <w:rPr>
+          <w:bCs/>
+          <w:sz w:val="22"/>
+          <w:szCs w:val="22"/>
+        </w:rPr>
+        <w:t>, we noticed some weird issues; moving to a different breadboard</w:t>
+      </w:r>
+      <w:r>
+        <w:rPr>
+          <w:bCs/>
+          <w:sz w:val="22"/>
+          <w:szCs w:val="22"/>
+        </w:rPr>
+        <w:t xml:space="preserve"> solved the issue with bad connections. We tried the buttons with and without </w:t>
+      </w:r>
+      <w:r>
+        <w:rPr>
+          <w:bCs/>
+          <w:sz w:val="22"/>
+          <w:szCs w:val="22"/>
+        </w:rPr>
+        <w:t>pull-down</w:t>
+      </w:r>
+      <w:r>
+        <w:rPr>
+          <w:bCs/>
+          <w:sz w:val="22"/>
+          <w:szCs w:val="22"/>
+        </w:rPr>
+        <w:t xml:space="preserve"> resistors to check the result</w:t>
       </w:r>
       <w:r>
         <w:rPr>
@@ -3378,15 +3441,79 @@
           <w:sz w:val="22"/>
           <w:szCs w:val="22"/>
         </w:rPr>
-        <w:t xml:space="preserve">Next we attached the joy stick we have. Using the same code we were able to read the </w:t>
-      </w:r>
-      <w:r>
-        <w:rPr>
-          <w:bCs/>
-          <w:sz w:val="22"/>
-          <w:szCs w:val="22"/>
-        </w:rPr>
-        <w:t>many different values of the joystick movement. We did have an issue where we need to connect the joystick button to a different pin to allow for serial communication. We also noticed that we are required to have a pull down resistor on the joystick button to make it work also. This makes sense.</w:t>
+        <w:t>Next</w:t>
+      </w:r>
+      <w:r>
+        <w:rPr>
+          <w:bCs/>
+          <w:sz w:val="22"/>
+          <w:szCs w:val="22"/>
+        </w:rPr>
+        <w:t>, we attached the joystick</w:t>
+      </w:r>
+      <w:r>
+        <w:rPr>
+          <w:bCs/>
+          <w:sz w:val="22"/>
+          <w:szCs w:val="22"/>
+        </w:rPr>
+        <w:t xml:space="preserve"> we have. Using the same code</w:t>
+      </w:r>
+      <w:r>
+        <w:rPr>
+          <w:bCs/>
+          <w:sz w:val="22"/>
+          <w:szCs w:val="22"/>
+        </w:rPr>
+        <w:t>,</w:t>
+      </w:r>
+      <w:r>
+        <w:rPr>
+          <w:bCs/>
+          <w:sz w:val="22"/>
+          <w:szCs w:val="22"/>
+        </w:rPr>
+        <w:t xml:space="preserve"> we were able to read the </w:t>
+      </w:r>
+      <w:r>
+        <w:rPr>
+          <w:bCs/>
+          <w:sz w:val="22"/>
+          <w:szCs w:val="22"/>
+        </w:rPr>
+        <w:t xml:space="preserve">many different values of the joystick movement. We did have an issue where we </w:t>
+      </w:r>
+      <w:r>
+        <w:rPr>
+          <w:bCs/>
+          <w:sz w:val="22"/>
+          <w:szCs w:val="22"/>
+        </w:rPr>
+        <w:t>needed</w:t>
+      </w:r>
+      <w:r>
+        <w:rPr>
+          <w:bCs/>
+          <w:sz w:val="22"/>
+          <w:szCs w:val="22"/>
+        </w:rPr>
+        <w:t xml:space="preserve"> to connect the joystick button to a different pin to allow for serial communication. We also noticed that we are required to have a </w:t>
+      </w:r>
+      <w:r>
+        <w:rPr>
+          <w:bCs/>
+          <w:sz w:val="22"/>
+          <w:szCs w:val="22"/>
+        </w:rPr>
+        <w:t>pull-down resistor on the joystick button to make it work</w:t>
+      </w:r>
+      <w:r>
+        <w:rPr>
+          <w:bCs/>
+          <w:sz w:val="22"/>
+          <w:szCs w:val="22"/>
+        </w:rPr>
+        <w:t>. This makes sense.</w:t>
       </w:r>
     </w:p>
     <w:p>
@@ -3411,34 +3538,324 @@
           <w:sz w:val="22"/>
           <w:szCs w:val="22"/>
         </w:rPr>
-        <w:t xml:space="preserve">We watched this video on how to setup our OLED display: </w:t>
-      </w:r>
-      <w:hyperlink r:id="rId15" w:history="1">
-        <w:r>
-          <w:rPr>
-            <w:rStyle w:val="Hyperlink"/>
-            <w:bCs/>
-            <w:sz w:val="22"/>
-            <w:szCs w:val="22"/>
-          </w:rPr>
-          <w:t>youtube.com/watch?v=uA6DbLMcWhU&amp;feature=youtu.be</w:t>
-        </w:r>
-      </w:hyperlink>
-      <w:r>
-        <w:rPr>
-          <w:bCs/>
-          <w:sz w:val="22"/>
-          <w:szCs w:val="22"/>
-        </w:rPr>
-        <w:t xml:space="preserve"> After review the video we installed the needed libraries and was able to successfully display the data we were receiving from the buttons and joystick!</w:t>
-      </w:r>
-      <w:r>
-        <w:rPr>
-          <w:bCs/>
-          <w:sz w:val="22"/>
-          <w:szCs w:val="22"/>
-        </w:rPr>
-        <w:t xml:space="preserve"> We also learned the OLED uses A4 and A5 pins so we need to change our pinout, luckily this allows for us to connect the button on the Joystick</w:t>
+        <w:t xml:space="preserve">We watched this video on how to </w:t>
+      </w:r>
+      <w:r>
+        <w:rPr>
+          <w:bCs/>
+          <w:sz w:val="22"/>
+          <w:szCs w:val="22"/>
+        </w:rPr>
+        <w:t>set up our OLED display: youtube.com/watch?v=uA6DbLMcWhU&amp;feature=youtu.be. After reviewing the video, we installed the needed libraries and were</w:t>
+      </w:r>
+      <w:r>
+        <w:rPr>
+          <w:bCs/>
+          <w:sz w:val="22"/>
+          <w:szCs w:val="22"/>
+        </w:rPr>
+        <w:t xml:space="preserve"> able to successfully display the data we were receiving from the buttons and joystick!</w:t>
+      </w:r>
+      <w:r>
+        <w:rPr>
+          <w:bCs/>
+          <w:sz w:val="22"/>
+          <w:szCs w:val="22"/>
+        </w:rPr>
+        <w:t xml:space="preserve"> We also learned the OLED uses A4 and A5 pins</w:t>
+      </w:r>
+      <w:r>
+        <w:rPr>
+          <w:bCs/>
+          <w:sz w:val="22"/>
+          <w:szCs w:val="22"/>
+        </w:rPr>
+        <w:t>,</w:t>
+      </w:r>
+      <w:r>
+        <w:rPr>
+          <w:bCs/>
+          <w:sz w:val="22"/>
+          <w:szCs w:val="22"/>
+        </w:rPr>
+        <w:t xml:space="preserve"> so we need to change our pinout, luckily this allows for us to connect the button on the Joystick</w:t>
+      </w:r>
+    </w:p>
+    <w:p>
+      <w:pPr>
+        <w:rPr>
+          <w:bCs/>
+          <w:sz w:val="22"/>
+          <w:szCs w:val="22"/>
+        </w:rPr>
+      </w:pPr>
+      <w:r>
+        <w:rPr>
+          <w:bCs/>
+          <w:sz w:val="22"/>
+          <w:szCs w:val="22"/>
+        </w:rPr>
+        <w:t>10-24</w:t>
+      </w:r>
+    </w:p>
+    <w:p>
+      <w:pPr>
+        <w:rPr>
+          <w:bCs/>
+          <w:sz w:val="22"/>
+          <w:szCs w:val="22"/>
+        </w:rPr>
+      </w:pPr>
+      <w:r>
+        <w:rPr>
+          <w:bCs/>
+          <w:sz w:val="22"/>
+          <w:szCs w:val="22"/>
+        </w:rPr>
+        <w:t xml:space="preserve">This time we went with using the RF chip to connect two Arduinos together. </w:t>
+      </w:r>
+      <w:r>
+        <w:rPr>
+          <w:bCs/>
+          <w:sz w:val="22"/>
+          <w:szCs w:val="22"/>
+        </w:rPr>
+        <w:t xml:space="preserve">After quickly downloading the RF24 library and looking at the code, we </w:t>
+      </w:r>
+      <w:r>
+        <w:rPr>
+          <w:bCs/>
+          <w:sz w:val="22"/>
+          <w:szCs w:val="22"/>
+        </w:rPr>
+        <w:t xml:space="preserve">learned we need to change the button layouts to be able to use the </w:t>
+      </w:r>
+      <w:r>
+        <w:rPr>
+          <w:bCs/>
+          <w:sz w:val="22"/>
+          <w:szCs w:val="22"/>
+        </w:rPr>
+        <w:t>RF24. This was no big issue</w:t>
+      </w:r>
+      <w:r>
+        <w:rPr>
+          <w:bCs/>
+          <w:sz w:val="22"/>
+          <w:szCs w:val="22"/>
+        </w:rPr>
+        <w:t>,</w:t>
+      </w:r>
+      <w:r>
+        <w:rPr>
+          <w:bCs/>
+          <w:sz w:val="22"/>
+          <w:szCs w:val="22"/>
+        </w:rPr>
+        <w:t xml:space="preserve"> and after learning about the quick write function with the help of AI</w:t>
+      </w:r>
+      <w:r>
+        <w:rPr>
+          <w:bCs/>
+          <w:sz w:val="22"/>
+          <w:szCs w:val="22"/>
+        </w:rPr>
+        <w:t>,</w:t>
+      </w:r>
+      <w:r>
+        <w:rPr>
+          <w:bCs/>
+          <w:sz w:val="22"/>
+          <w:szCs w:val="22"/>
+        </w:rPr>
+        <w:t xml:space="preserve"> we were able to connect our </w:t>
+      </w:r>
+      <w:r>
+        <w:rPr>
+          <w:bCs/>
+          <w:sz w:val="22"/>
+          <w:szCs w:val="22"/>
+        </w:rPr>
+        <w:t>Arduino to another Arduino w</w:t>
+      </w:r>
+      <w:r>
+        <w:rPr>
+          <w:bCs/>
+          <w:sz w:val="22"/>
+          <w:szCs w:val="22"/>
+        </w:rPr>
+        <w:t xml:space="preserve">hile still having the ability to use </w:t>
+      </w:r>
+      <w:r>
+        <w:rPr>
+          <w:bCs/>
+          <w:sz w:val="22"/>
+          <w:szCs w:val="22"/>
+        </w:rPr>
+        <w:t xml:space="preserve">SPI communication! </w:t>
+      </w:r>
+    </w:p>
+    <w:p>
+      <w:pPr>
+        <w:rPr>
+          <w:bCs/>
+          <w:sz w:val="22"/>
+          <w:szCs w:val="22"/>
+        </w:rPr>
+      </w:pPr>
+      <w:r>
+        <w:rPr>
+          <w:bCs/>
+          <w:sz w:val="22"/>
+          <w:szCs w:val="22"/>
+        </w:rPr>
+        <w:t>10-</w:t>
+      </w:r>
+      <w:r>
+        <w:rPr>
+          <w:bCs/>
+          <w:sz w:val="22"/>
+          <w:szCs w:val="22"/>
+        </w:rPr>
+        <w:t>27</w:t>
+      </w:r>
+    </w:p>
+    <w:p>
+      <w:pPr>
+        <w:rPr>
+          <w:bCs/>
+          <w:sz w:val="22"/>
+          <w:szCs w:val="22"/>
+        </w:rPr>
+      </w:pPr>
+      <w:r>
+        <w:rPr>
+          <w:bCs/>
+          <w:sz w:val="22"/>
+          <w:szCs w:val="22"/>
+        </w:rPr>
+        <w:t>This day we needed to find the solution to our most challenging problem</w:t>
+      </w:r>
+      <w:r>
+        <w:rPr>
+          <w:bCs/>
+          <w:sz w:val="22"/>
+          <w:szCs w:val="22"/>
+        </w:rPr>
+        <w:t>:</w:t>
+      </w:r>
+      <w:r>
+        <w:rPr>
+          <w:bCs/>
+          <w:sz w:val="22"/>
+          <w:szCs w:val="22"/>
+        </w:rPr>
+        <w:t xml:space="preserve"> powering. After a lot of AI and </w:t>
+      </w:r>
+      <w:r>
+        <w:rPr>
+          <w:bCs/>
+          <w:sz w:val="22"/>
+          <w:szCs w:val="22"/>
+        </w:rPr>
+        <w:t xml:space="preserve">discussion, we determined we would use three AAA batteries for the controller. It will pass through </w:t>
+      </w:r>
+      <w:r>
+        <w:rPr>
+          <w:bCs/>
+          <w:sz w:val="22"/>
+          <w:szCs w:val="22"/>
+        </w:rPr>
+        <w:t xml:space="preserve">a power </w:t>
+      </w:r>
+      <w:r>
+        <w:rPr>
+          <w:bCs/>
+          <w:sz w:val="22"/>
+          <w:szCs w:val="22"/>
+        </w:rPr>
+        <w:t xml:space="preserve">XL3608 </w:t>
+      </w:r>
+      <w:r>
+        <w:rPr>
+          <w:bCs/>
+          <w:sz w:val="22"/>
+          <w:szCs w:val="22"/>
+        </w:rPr>
+        <w:t xml:space="preserve">to go from 4.5v to 5.0v and then </w:t>
+      </w:r>
+      <w:r>
+        <w:rPr>
+          <w:bCs/>
+          <w:sz w:val="22"/>
+          <w:szCs w:val="22"/>
+        </w:rPr>
+        <w:t>from 5 V</w:t>
+      </w:r>
+      <w:r>
+        <w:rPr>
+          <w:bCs/>
+          <w:sz w:val="22"/>
+          <w:szCs w:val="22"/>
+        </w:rPr>
+        <w:t xml:space="preserve"> to 3.3v through </w:t>
+      </w:r>
+      <w:r>
+        <w:rPr>
+          <w:bCs/>
+          <w:sz w:val="22"/>
+          <w:szCs w:val="22"/>
+        </w:rPr>
+        <w:t>an</w:t>
+      </w:r>
+      <w:r>
+        <w:rPr>
+          <w:bCs/>
+          <w:sz w:val="22"/>
+          <w:szCs w:val="22"/>
+        </w:rPr>
+        <w:t xml:space="preserve"> AMS1117 </w:t>
+      </w:r>
+    </w:p>
+    <w:p>
+      <w:pPr>
+        <w:rPr>
+          <w:bCs/>
+          <w:sz w:val="22"/>
+          <w:szCs w:val="22"/>
+        </w:rPr>
+      </w:pPr>
+      <w:r>
+        <w:rPr>
+          <w:bCs/>
+          <w:sz w:val="22"/>
+          <w:szCs w:val="22"/>
+        </w:rPr>
+        <w:t>We also started looking for the footprints to create a PCB</w:t>
+      </w:r>
+      <w:r>
+        <w:rPr>
+          <w:bCs/>
+          <w:sz w:val="22"/>
+          <w:szCs w:val="22"/>
+        </w:rPr>
+        <w:t xml:space="preserve">. We would like to design a </w:t>
+      </w:r>
+      <w:r>
+        <w:rPr>
+          <w:bCs/>
+          <w:sz w:val="22"/>
+          <w:szCs w:val="22"/>
+        </w:rPr>
+        <w:t>PCB to avoid the annoying connection to the RF and allow us to create a finished</w:t>
+      </w:r>
+      <w:r>
+        <w:rPr>
+          <w:bCs/>
+          <w:sz w:val="22"/>
+          <w:szCs w:val="22"/>
+        </w:rPr>
+        <w:t xml:space="preserve"> product. </w:t>
       </w:r>
     </w:p>
     <w:sectPr>

</xml_diff>